<commit_message>
docs: update 3 manuals to v2.0/v2.1 + regenerate DOCX/HTML
ESTRUCTURA v2.0: 5 fallbacks, 7 AsyncStorage keys, Build 15, safety points
CONEXIONES v2.0: full chains nativa/PWA, AsyncStorage table, CC consumption
MONITORING v2.1: version bump

Co-Authored-By: Claude Opus 4.6 (1M context) <noreply@anthropic.com>
</commit_message>
<xml_diff>
--- a/docs/MONITORING-AUREX.docx
+++ b/docs/MONITORING-AUREX.docx
@@ -7,7 +7,7 @@
         <w:pStyle w:val="Title"/>
       </w:pPr>
       <w:r>
-        <w:t xml:space="preserve">MONITORING — AUREX v2.0</w:t>
+        <w:t xml:space="preserve">MONITORING — AUREX v2.1</w:t>
       </w:r>
     </w:p>
     <w:bookmarkStart w:id="26" w:name="X06c8620f6ebfb610f7da0f00eeff1050bc3ca34"/>
@@ -56,7 +56,7 @@
         <w:t xml:space="preserve"> </w:t>
       </w:r>
       <w:r>
-        <w:t xml:space="preserve">— v2.0 (Kraken fallback + CC counter + /api/crypto-prices)</w:t>
+        <w:t xml:space="preserve">— v2.1 (Build 15 + AsyncStorage cache + Clearbit logos) (Kraken fallback + CC counter + /api/crypto-prices)</w:t>
       </w:r>
     </w:p>
     <w:p>

</xml_diff>